<commit_message>
Aula 0604 - MOBILE - Props | IoT - DHT22 | Pequena correção da somativa de Back
</commit_message>
<xml_diff>
--- a/SENAI/BACK-END/Semestre 2/atividades_nota/Somativa/api_restaurante/relatorio_validacao_api_menuFlex_andrewclarck.docx
+++ b/SENAI/BACK-END/Semestre 2/atividades_nota/Somativa/api_restaurante/relatorio_validacao_api_menuFlex_andrewclarck.docx
@@ -81,7 +81,19 @@
         <w:rPr>
           <w:rFonts w:ascii="Arial" w:hAnsi="Arial"/>
         </w:rPr>
-        <w:t xml:space="preserve"> Tecnologia presta serviços de desenvolvimento de sistemas web para pequenos negócios. Um de seus clientes, o restaurante “Cantina </w:t>
+        <w:t xml:space="preserve"> Tecnologia presta serviços de desenvolvimento de sistemas web para </w:t>
+      </w:r>
+      <w:r>
+        <w:rPr>
+          <w:rFonts w:ascii="Arial" w:hAnsi="Arial"/>
+        </w:rPr>
+        <w:t>pequenos</w:t>
+      </w:r>
+      <w:r>
+        <w:rPr>
+          <w:rFonts w:ascii="Arial" w:hAnsi="Arial"/>
+        </w:rPr>
+        <w:t xml:space="preserve"> negócios. Um de seus clientes, o restaurante “Cantina </w:t>
       </w:r>
       <w:proofErr w:type="spellStart"/>
       <w:r>
@@ -435,6 +447,7 @@
       <w:r>
         <w:rPr>
           <w:rFonts w:ascii="Arial" w:hAnsi="Arial"/>
+          <w:noProof/>
         </w:rPr>
         <w:drawing>
           <wp:inline distT="0" distB="0" distL="0" distR="0" wp14:anchorId="3471C792" wp14:editId="0DE3F30C">
@@ -528,6 +541,7 @@
       <w:r>
         <w:rPr>
           <w:rFonts w:ascii="Arial" w:hAnsi="Arial"/>
+          <w:noProof/>
         </w:rPr>
         <w:drawing>
           <wp:inline distT="0" distB="0" distL="0" distR="0" wp14:anchorId="0C01F9BE" wp14:editId="1D017B36">
@@ -751,6 +765,7 @@
       <w:r>
         <w:rPr>
           <w:rFonts w:ascii="Arial" w:hAnsi="Arial"/>
+          <w:noProof/>
         </w:rPr>
         <w:drawing>
           <wp:inline distT="0" distB="0" distL="0" distR="0" wp14:anchorId="42D6AF5C" wp14:editId="0FC8023A">
@@ -1072,14 +1087,7 @@
         <w:rPr>
           <w:rFonts w:ascii="Arial" w:hAnsi="Arial"/>
         </w:rPr>
-        <w:t xml:space="preserve">3 – Explique a finalidade do </w:t>
-      </w:r>
-      <w:proofErr w:type="gramStart"/>
-      <w:r>
-        <w:rPr>
-          <w:rFonts w:ascii="Arial" w:hAnsi="Arial"/>
-        </w:rPr>
-        <w:t xml:space="preserve">arquivo </w:t>
+        <w:t xml:space="preserve">3 – Explique a finalidade do arquivo </w:t>
       </w:r>
       <w:r>
         <w:rPr>
@@ -1099,7 +1107,6 @@
         <w:t>env</w:t>
       </w:r>
       <w:proofErr w:type="spellEnd"/>
-      <w:proofErr w:type="gramEnd"/>
       <w:r>
         <w:rPr>
           <w:rFonts w:ascii="Arial" w:hAnsi="Arial"/>
@@ -1193,7 +1200,6 @@
         <w:t xml:space="preserve">. Descreva o papel do arquivo </w:t>
       </w:r>
       <w:proofErr w:type="spellStart"/>
-      <w:proofErr w:type="gramStart"/>
       <w:r>
         <w:rPr>
           <w:rFonts w:ascii="Arial" w:hAnsi="Arial"/>
@@ -1203,7 +1209,6 @@
         <w:t>package.json</w:t>
       </w:r>
       <w:proofErr w:type="spellEnd"/>
-      <w:proofErr w:type="gramEnd"/>
       <w:r>
         <w:rPr>
           <w:rFonts w:ascii="Arial" w:hAnsi="Arial"/>
@@ -1337,6 +1342,7 @@
           <w:rFonts w:ascii="Arial" w:hAnsi="Arial"/>
           <w:b/>
           <w:bCs/>
+          <w:noProof/>
         </w:rPr>
         <w:drawing>
           <wp:inline distT="0" distB="0" distL="0" distR="0" wp14:anchorId="537E08E1" wp14:editId="10C7C391">
@@ -1551,6 +1557,7 @@
       <w:r>
         <w:rPr>
           <w:rFonts w:ascii="Arial" w:hAnsi="Arial"/>
+          <w:noProof/>
         </w:rPr>
         <w:drawing>
           <wp:inline distT="0" distB="0" distL="0" distR="0" wp14:anchorId="1B80DD38" wp14:editId="39B36DB5">
@@ -1703,7 +1710,6 @@
         <w:t xml:space="preserve">função </w:t>
       </w:r>
       <w:proofErr w:type="spellStart"/>
-      <w:proofErr w:type="gramStart"/>
       <w:r>
         <w:rPr>
           <w:rFonts w:ascii="Arial" w:hAnsi="Arial"/>
@@ -1719,16 +1725,7 @@
           <w:b/>
           <w:bCs/>
         </w:rPr>
-        <w:t>(</w:t>
-      </w:r>
-      <w:proofErr w:type="gramEnd"/>
-      <w:r>
-        <w:rPr>
-          <w:rFonts w:ascii="Arial" w:hAnsi="Arial"/>
-          <w:b/>
-          <w:bCs/>
-        </w:rPr>
-        <w:t>)</w:t>
+        <w:t>()</w:t>
       </w:r>
       <w:r>
         <w:rPr>
@@ -1772,6 +1769,7 @@
       <w:r>
         <w:rPr>
           <w:rFonts w:ascii="Arial" w:hAnsi="Arial"/>
+          <w:noProof/>
         </w:rPr>
         <w:drawing>
           <wp:inline distT="0" distB="0" distL="0" distR="0" wp14:anchorId="69A8A28D" wp14:editId="1858091F">
@@ -1875,115 +1873,99 @@
         <w:rPr>
           <w:rFonts w:ascii="Arial" w:hAnsi="Arial"/>
         </w:rPr>
+        <w:t xml:space="preserve"> { id } = </w:t>
+      </w:r>
+      <w:proofErr w:type="spellStart"/>
+      <w:r>
+        <w:rPr>
+          <w:rFonts w:ascii="Arial" w:hAnsi="Arial"/>
+        </w:rPr>
+        <w:t>req.params</w:t>
+      </w:r>
+      <w:proofErr w:type="spellEnd"/>
+      <w:r>
+        <w:rPr>
+          <w:rFonts w:ascii="Arial" w:hAnsi="Arial"/>
+        </w:rPr>
+        <w:t>”. Desses dois modos, a variável contaria com o valor de id requisitado na URL.</w:t>
+      </w:r>
+    </w:p>
+    <w:p>
+      <w:pPr>
+        <w:rPr>
+          <w:rFonts w:ascii="Arial" w:hAnsi="Arial"/>
+        </w:rPr>
+      </w:pPr>
+    </w:p>
+    <w:p>
+      <w:pPr>
+        <w:rPr>
+          <w:rFonts w:ascii="Arial" w:hAnsi="Arial"/>
+        </w:rPr>
+      </w:pPr>
+    </w:p>
+    <w:p>
+      <w:pPr>
+        <w:rPr>
+          <w:rFonts w:ascii="Arial" w:hAnsi="Arial"/>
+        </w:rPr>
+      </w:pPr>
+    </w:p>
+    <w:p>
+      <w:pPr>
+        <w:rPr>
+          <w:rFonts w:ascii="Arial" w:hAnsi="Arial"/>
+        </w:rPr>
+      </w:pPr>
+    </w:p>
+    <w:p>
+      <w:pPr>
+        <w:rPr>
+          <w:rFonts w:ascii="Arial" w:hAnsi="Arial"/>
+          <w:b/>
+          <w:bCs/>
+        </w:rPr>
+      </w:pPr>
+      <w:r>
+        <w:rPr>
+          <w:rFonts w:ascii="Arial" w:hAnsi="Arial"/>
+          <w:b/>
+          <w:bCs/>
+        </w:rPr>
+        <w:t>ETAPA C</w:t>
+      </w:r>
+    </w:p>
+    <w:p>
+      <w:pPr>
+        <w:rPr>
+          <w:rFonts w:ascii="Arial" w:hAnsi="Arial"/>
+          <w:b/>
+          <w:bCs/>
+        </w:rPr>
+      </w:pPr>
+      <w:r>
+        <w:rPr>
+          <w:rFonts w:ascii="Arial" w:hAnsi="Arial"/>
+          <w:b/>
+          <w:bCs/>
+        </w:rPr>
+        <w:t>1 –</w:t>
+      </w:r>
+    </w:p>
+    <w:p>
+      <w:pPr>
+        <w:rPr>
+          <w:rFonts w:ascii="Arial" w:hAnsi="Arial"/>
+        </w:rPr>
+      </w:pPr>
+      <w:r>
+        <w:rPr>
+          <w:rFonts w:ascii="Arial" w:hAnsi="Arial"/>
+          <w:b/>
+          <w:bCs/>
+        </w:rPr>
         <w:t xml:space="preserve"> </w:t>
       </w:r>
-      <w:proofErr w:type="gramStart"/>
-      <w:r>
-        <w:rPr>
-          <w:rFonts w:ascii="Arial" w:hAnsi="Arial"/>
-        </w:rPr>
-        <w:t>{ id</w:t>
-      </w:r>
-      <w:proofErr w:type="gramEnd"/>
-      <w:r>
-        <w:rPr>
-          <w:rFonts w:ascii="Arial" w:hAnsi="Arial"/>
-        </w:rPr>
-        <w:t xml:space="preserve"> } = </w:t>
-      </w:r>
-      <w:proofErr w:type="spellStart"/>
-      <w:proofErr w:type="gramStart"/>
-      <w:r>
-        <w:rPr>
-          <w:rFonts w:ascii="Arial" w:hAnsi="Arial"/>
-        </w:rPr>
-        <w:t>req.params</w:t>
-      </w:r>
-      <w:proofErr w:type="spellEnd"/>
-      <w:proofErr w:type="gramEnd"/>
-      <w:r>
-        <w:rPr>
-          <w:rFonts w:ascii="Arial" w:hAnsi="Arial"/>
-        </w:rPr>
-        <w:t>”. Desses dois modos, a variável contaria com o valor de id requisitado na URL.</w:t>
-      </w:r>
-    </w:p>
-    <w:p>
-      <w:pPr>
-        <w:rPr>
-          <w:rFonts w:ascii="Arial" w:hAnsi="Arial"/>
-        </w:rPr>
-      </w:pPr>
-    </w:p>
-    <w:p>
-      <w:pPr>
-        <w:rPr>
-          <w:rFonts w:ascii="Arial" w:hAnsi="Arial"/>
-        </w:rPr>
-      </w:pPr>
-    </w:p>
-    <w:p>
-      <w:pPr>
-        <w:rPr>
-          <w:rFonts w:ascii="Arial" w:hAnsi="Arial"/>
-        </w:rPr>
-      </w:pPr>
-    </w:p>
-    <w:p>
-      <w:pPr>
-        <w:rPr>
-          <w:rFonts w:ascii="Arial" w:hAnsi="Arial"/>
-        </w:rPr>
-      </w:pPr>
-    </w:p>
-    <w:p>
-      <w:pPr>
-        <w:rPr>
-          <w:rFonts w:ascii="Arial" w:hAnsi="Arial"/>
-          <w:b/>
-          <w:bCs/>
-        </w:rPr>
-      </w:pPr>
-      <w:r>
-        <w:rPr>
-          <w:rFonts w:ascii="Arial" w:hAnsi="Arial"/>
-          <w:b/>
-          <w:bCs/>
-        </w:rPr>
-        <w:t>ETAPA C</w:t>
-      </w:r>
-    </w:p>
-    <w:p>
-      <w:pPr>
-        <w:rPr>
-          <w:rFonts w:ascii="Arial" w:hAnsi="Arial"/>
-          <w:b/>
-          <w:bCs/>
-        </w:rPr>
-      </w:pPr>
-      <w:r>
-        <w:rPr>
-          <w:rFonts w:ascii="Arial" w:hAnsi="Arial"/>
-          <w:b/>
-          <w:bCs/>
-        </w:rPr>
-        <w:t>1 –</w:t>
-      </w:r>
-    </w:p>
-    <w:p>
-      <w:pPr>
-        <w:rPr>
-          <w:rFonts w:ascii="Arial" w:hAnsi="Arial"/>
-        </w:rPr>
-      </w:pPr>
-      <w:r>
-        <w:rPr>
-          <w:rFonts w:ascii="Arial" w:hAnsi="Arial"/>
-          <w:b/>
-          <w:bCs/>
-        </w:rPr>
-        <w:t xml:space="preserve"> </w:t>
-      </w:r>
       <w:r>
         <w:rPr>
           <w:rFonts w:ascii="Arial" w:hAnsi="Arial"/>
@@ -2092,6 +2074,7 @@
       <w:r>
         <w:rPr>
           <w:rFonts w:ascii="Arial" w:hAnsi="Arial"/>
+          <w:noProof/>
         </w:rPr>
         <w:drawing>
           <wp:inline distT="0" distB="0" distL="0" distR="0" wp14:anchorId="48FBC347" wp14:editId="7D7F67CF">
@@ -2167,21 +2150,7 @@
         <w:rPr>
           <w:rFonts w:ascii="Arial" w:hAnsi="Arial"/>
         </w:rPr>
-        <w:t xml:space="preserve"> produto”, a query escreve “WHERE id = id”, no entanto, deveria estar “WHERE id </w:t>
-      </w:r>
-      <w:proofErr w:type="gramStart"/>
-      <w:r>
-        <w:rPr>
-          <w:rFonts w:ascii="Arial" w:hAnsi="Arial"/>
-        </w:rPr>
-        <w:t>= ?</w:t>
-      </w:r>
-      <w:proofErr w:type="gramEnd"/>
-      <w:r>
-        <w:rPr>
-          <w:rFonts w:ascii="Arial" w:hAnsi="Arial"/>
-        </w:rPr>
-        <w:t xml:space="preserve">”, para que a função substitua pelo valor dado, que seria o de id, caso ele estivesse correto.  </w:t>
+        <w:t xml:space="preserve"> produto”, a query escreve “WHERE id = id”, no entanto, deveria estar “WHERE id = ?”, para que a função substitua pelo valor dado, que seria o de id, caso ele estivesse correto.  </w:t>
       </w:r>
     </w:p>
     <w:p>
@@ -2208,7 +2177,6 @@
         </w:rPr>
       </w:pPr>
       <w:proofErr w:type="spellStart"/>
-      <w:proofErr w:type="gramStart"/>
       <w:r>
         <w:rPr>
           <w:rFonts w:ascii="Arial" w:hAnsi="Arial"/>
@@ -2220,14 +2188,7 @@
         <w:rPr>
           <w:rFonts w:ascii="Arial" w:hAnsi="Arial"/>
         </w:rPr>
-        <w:t>(</w:t>
-      </w:r>
-      <w:proofErr w:type="gramEnd"/>
-      <w:r>
-        <w:rPr>
-          <w:rFonts w:ascii="Arial" w:hAnsi="Arial"/>
-        </w:rPr>
-        <w:t xml:space="preserve">"/produtos", </w:t>
+        <w:t xml:space="preserve">("/produtos", </w:t>
       </w:r>
       <w:proofErr w:type="spellStart"/>
       <w:r>
@@ -2282,221 +2243,224 @@
         <w:rPr>
           <w:rFonts w:ascii="Arial" w:hAnsi="Arial"/>
         </w:rPr>
+        <w:t xml:space="preserve"> { nome, </w:t>
+      </w:r>
+      <w:proofErr w:type="spellStart"/>
+      <w:r>
+        <w:rPr>
+          <w:rFonts w:ascii="Arial" w:hAnsi="Arial"/>
+        </w:rPr>
+        <w:t>descricao</w:t>
+      </w:r>
+      <w:proofErr w:type="spellEnd"/>
+      <w:r>
+        <w:rPr>
+          <w:rFonts w:ascii="Arial" w:hAnsi="Arial"/>
+        </w:rPr>
+        <w:t xml:space="preserve">, </w:t>
+      </w:r>
+      <w:proofErr w:type="spellStart"/>
+      <w:r>
+        <w:rPr>
+          <w:rFonts w:ascii="Arial" w:hAnsi="Arial"/>
+        </w:rPr>
+        <w:t>preco</w:t>
+      </w:r>
+      <w:proofErr w:type="spellEnd"/>
+      <w:r>
+        <w:rPr>
+          <w:rFonts w:ascii="Arial" w:hAnsi="Arial"/>
+        </w:rPr>
+        <w:t xml:space="preserve">, categoria, </w:t>
+      </w:r>
+      <w:proofErr w:type="spellStart"/>
+      <w:r>
+        <w:rPr>
+          <w:rFonts w:ascii="Arial" w:hAnsi="Arial"/>
+        </w:rPr>
+        <w:t>disponivel</w:t>
+      </w:r>
+      <w:proofErr w:type="spellEnd"/>
+      <w:r>
+        <w:rPr>
+          <w:rFonts w:ascii="Arial" w:hAnsi="Arial"/>
+        </w:rPr>
+        <w:t xml:space="preserve"> } = </w:t>
+      </w:r>
+      <w:proofErr w:type="spellStart"/>
+      <w:r>
+        <w:rPr>
+          <w:rFonts w:ascii="Arial" w:hAnsi="Arial"/>
+        </w:rPr>
+        <w:t>req.body</w:t>
+      </w:r>
+      <w:proofErr w:type="spellEnd"/>
+      <w:r>
+        <w:rPr>
+          <w:rFonts w:ascii="Arial" w:hAnsi="Arial"/>
+        </w:rPr>
+        <w:t>;</w:t>
+      </w:r>
+    </w:p>
+    <w:p>
+      <w:pPr>
+        <w:rPr>
+          <w:rFonts w:ascii="Arial" w:hAnsi="Arial"/>
+        </w:rPr>
+      </w:pPr>
+      <w:r>
+        <w:rPr>
+          <w:rFonts w:ascii="Arial" w:hAnsi="Arial"/>
+        </w:rPr>
+        <w:t xml:space="preserve">  </w:t>
+      </w:r>
+      <w:proofErr w:type="spellStart"/>
+      <w:r>
+        <w:rPr>
+          <w:rFonts w:ascii="Arial" w:hAnsi="Arial"/>
+        </w:rPr>
+        <w:t>try</w:t>
+      </w:r>
+      <w:proofErr w:type="spellEnd"/>
+      <w:r>
+        <w:rPr>
+          <w:rFonts w:ascii="Arial" w:hAnsi="Arial"/>
+        </w:rPr>
+        <w:t xml:space="preserve"> {</w:t>
+      </w:r>
+    </w:p>
+    <w:p>
+      <w:pPr>
+        <w:rPr>
+          <w:rFonts w:ascii="Arial" w:hAnsi="Arial"/>
+        </w:rPr>
+      </w:pPr>
+      <w:r>
+        <w:rPr>
+          <w:rFonts w:ascii="Arial" w:hAnsi="Arial"/>
+        </w:rPr>
+        <w:t xml:space="preserve">    </w:t>
+      </w:r>
+      <w:proofErr w:type="spellStart"/>
+      <w:r>
+        <w:rPr>
+          <w:rFonts w:ascii="Arial" w:hAnsi="Arial"/>
+        </w:rPr>
+        <w:t>if</w:t>
+      </w:r>
+      <w:proofErr w:type="spellEnd"/>
+      <w:r>
+        <w:rPr>
+          <w:rFonts w:ascii="Arial" w:hAnsi="Arial"/>
+        </w:rPr>
+        <w:t xml:space="preserve"> ((!nome</w:t>
+      </w:r>
+      <w:r>
+        <w:rPr>
+          <w:rFonts w:ascii="Arial" w:hAnsi="Arial"/>
+        </w:rPr>
+        <w:t xml:space="preserve"> ||</w:t>
+      </w:r>
+      <w:r>
+        <w:rPr>
+          <w:rFonts w:ascii="Arial" w:hAnsi="Arial"/>
+        </w:rPr>
+        <w:t xml:space="preserve"> !</w:t>
+      </w:r>
+      <w:proofErr w:type="spellStart"/>
+      <w:r>
+        <w:rPr>
+          <w:rFonts w:ascii="Arial" w:hAnsi="Arial"/>
+        </w:rPr>
+        <w:t>descricao</w:t>
+      </w:r>
+      <w:proofErr w:type="spellEnd"/>
+      <w:r>
+        <w:rPr>
+          <w:rFonts w:ascii="Arial" w:hAnsi="Arial"/>
+        </w:rPr>
+        <w:t xml:space="preserve"> ||</w:t>
+      </w:r>
+      <w:r>
+        <w:rPr>
+          <w:rFonts w:ascii="Arial" w:hAnsi="Arial"/>
+        </w:rPr>
+        <w:t xml:space="preserve"> !</w:t>
+      </w:r>
+      <w:proofErr w:type="spellStart"/>
+      <w:r>
+        <w:rPr>
+          <w:rFonts w:ascii="Arial" w:hAnsi="Arial"/>
+        </w:rPr>
+        <w:t>preco</w:t>
+      </w:r>
+      <w:proofErr w:type="spellEnd"/>
+      <w:r>
+        <w:rPr>
+          <w:rFonts w:ascii="Arial" w:hAnsi="Arial"/>
+        </w:rPr>
+        <w:t xml:space="preserve"> ||</w:t>
+      </w:r>
+      <w:r>
+        <w:rPr>
+          <w:rFonts w:ascii="Arial" w:hAnsi="Arial"/>
+        </w:rPr>
+        <w:t xml:space="preserve"> !categoria</w:t>
+      </w:r>
+      <w:r>
+        <w:rPr>
+          <w:rFonts w:ascii="Arial" w:hAnsi="Arial"/>
+        </w:rPr>
+        <w:t xml:space="preserve"> ||</w:t>
+      </w:r>
+      <w:r>
+        <w:rPr>
+          <w:rFonts w:ascii="Arial" w:hAnsi="Arial"/>
+        </w:rPr>
+        <w:t xml:space="preserve"> !</w:t>
+      </w:r>
+      <w:proofErr w:type="spellStart"/>
+      <w:r>
+        <w:rPr>
+          <w:rFonts w:ascii="Arial" w:hAnsi="Arial"/>
+        </w:rPr>
+        <w:t>disponivel</w:t>
+      </w:r>
+      <w:proofErr w:type="spellEnd"/>
+      <w:r>
+        <w:rPr>
+          <w:rFonts w:ascii="Arial" w:hAnsi="Arial"/>
+        </w:rPr>
+        <w:t>)) {</w:t>
+      </w:r>
+    </w:p>
+    <w:p>
+      <w:pPr>
+        <w:rPr>
+          <w:rFonts w:ascii="Arial" w:hAnsi="Arial"/>
+        </w:rPr>
+      </w:pPr>
+      <w:r>
+        <w:rPr>
+          <w:rFonts w:ascii="Arial" w:hAnsi="Arial"/>
+        </w:rPr>
+        <w:t xml:space="preserve">      </w:t>
+      </w:r>
+      <w:proofErr w:type="spellStart"/>
+      <w:r>
+        <w:rPr>
+          <w:rFonts w:ascii="Arial" w:hAnsi="Arial"/>
+        </w:rPr>
+        <w:t>return</w:t>
+      </w:r>
+      <w:proofErr w:type="spellEnd"/>
+      <w:r>
+        <w:rPr>
+          <w:rFonts w:ascii="Arial" w:hAnsi="Arial"/>
+        </w:rPr>
         <w:t xml:space="preserve"> </w:t>
       </w:r>
-      <w:proofErr w:type="gramStart"/>
-      <w:r>
-        <w:rPr>
-          <w:rFonts w:ascii="Arial" w:hAnsi="Arial"/>
-        </w:rPr>
-        <w:t>{ nome</w:t>
-      </w:r>
-      <w:proofErr w:type="gramEnd"/>
-      <w:r>
-        <w:rPr>
-          <w:rFonts w:ascii="Arial" w:hAnsi="Arial"/>
-        </w:rPr>
-        <w:t xml:space="preserve">, </w:t>
-      </w:r>
-      <w:proofErr w:type="spellStart"/>
-      <w:r>
-        <w:rPr>
-          <w:rFonts w:ascii="Arial" w:hAnsi="Arial"/>
-        </w:rPr>
-        <w:t>descricao</w:t>
-      </w:r>
-      <w:proofErr w:type="spellEnd"/>
-      <w:r>
-        <w:rPr>
-          <w:rFonts w:ascii="Arial" w:hAnsi="Arial"/>
-        </w:rPr>
-        <w:t xml:space="preserve">, </w:t>
-      </w:r>
-      <w:proofErr w:type="spellStart"/>
-      <w:r>
-        <w:rPr>
-          <w:rFonts w:ascii="Arial" w:hAnsi="Arial"/>
-        </w:rPr>
-        <w:t>preco</w:t>
-      </w:r>
-      <w:proofErr w:type="spellEnd"/>
-      <w:r>
-        <w:rPr>
-          <w:rFonts w:ascii="Arial" w:hAnsi="Arial"/>
-        </w:rPr>
-        <w:t xml:space="preserve">, categoria, </w:t>
-      </w:r>
-      <w:proofErr w:type="spellStart"/>
-      <w:proofErr w:type="gramStart"/>
-      <w:r>
-        <w:rPr>
-          <w:rFonts w:ascii="Arial" w:hAnsi="Arial"/>
-        </w:rPr>
-        <w:t>disponivel</w:t>
-      </w:r>
-      <w:proofErr w:type="spellEnd"/>
-      <w:r>
-        <w:rPr>
-          <w:rFonts w:ascii="Arial" w:hAnsi="Arial"/>
-        </w:rPr>
-        <w:t xml:space="preserve"> }</w:t>
-      </w:r>
-      <w:proofErr w:type="gramEnd"/>
-      <w:r>
-        <w:rPr>
-          <w:rFonts w:ascii="Arial" w:hAnsi="Arial"/>
-        </w:rPr>
-        <w:t xml:space="preserve"> = </w:t>
-      </w:r>
-      <w:proofErr w:type="spellStart"/>
-      <w:proofErr w:type="gramStart"/>
-      <w:r>
-        <w:rPr>
-          <w:rFonts w:ascii="Arial" w:hAnsi="Arial"/>
-        </w:rPr>
-        <w:t>req.body</w:t>
-      </w:r>
-      <w:proofErr w:type="spellEnd"/>
-      <w:proofErr w:type="gramEnd"/>
-      <w:r>
-        <w:rPr>
-          <w:rFonts w:ascii="Arial" w:hAnsi="Arial"/>
-        </w:rPr>
-        <w:t>;</w:t>
-      </w:r>
-    </w:p>
-    <w:p>
-      <w:pPr>
-        <w:rPr>
-          <w:rFonts w:ascii="Arial" w:hAnsi="Arial"/>
-        </w:rPr>
-      </w:pPr>
-      <w:r>
-        <w:rPr>
-          <w:rFonts w:ascii="Arial" w:hAnsi="Arial"/>
-        </w:rPr>
-        <w:t xml:space="preserve">  </w:t>
-      </w:r>
-      <w:proofErr w:type="spellStart"/>
-      <w:r>
-        <w:rPr>
-          <w:rFonts w:ascii="Arial" w:hAnsi="Arial"/>
-        </w:rPr>
-        <w:t>try</w:t>
-      </w:r>
-      <w:proofErr w:type="spellEnd"/>
-      <w:r>
-        <w:rPr>
-          <w:rFonts w:ascii="Arial" w:hAnsi="Arial"/>
-        </w:rPr>
-        <w:t xml:space="preserve"> {</w:t>
-      </w:r>
-    </w:p>
-    <w:p>
-      <w:pPr>
-        <w:rPr>
-          <w:rFonts w:ascii="Arial" w:hAnsi="Arial"/>
-        </w:rPr>
-      </w:pPr>
-      <w:r>
-        <w:rPr>
-          <w:rFonts w:ascii="Arial" w:hAnsi="Arial"/>
-        </w:rPr>
-        <w:t xml:space="preserve">    </w:t>
-      </w:r>
-      <w:proofErr w:type="spellStart"/>
-      <w:r>
-        <w:rPr>
-          <w:rFonts w:ascii="Arial" w:hAnsi="Arial"/>
-        </w:rPr>
-        <w:t>if</w:t>
-      </w:r>
-      <w:proofErr w:type="spellEnd"/>
-      <w:r>
-        <w:rPr>
-          <w:rFonts w:ascii="Arial" w:hAnsi="Arial"/>
-        </w:rPr>
-        <w:t xml:space="preserve"> (</w:t>
-      </w:r>
-      <w:proofErr w:type="gramStart"/>
-      <w:r>
-        <w:rPr>
-          <w:rFonts w:ascii="Arial" w:hAnsi="Arial"/>
-        </w:rPr>
-        <w:t>(!nome, !</w:t>
-      </w:r>
-      <w:proofErr w:type="spellStart"/>
-      <w:r>
-        <w:rPr>
-          <w:rFonts w:ascii="Arial" w:hAnsi="Arial"/>
-        </w:rPr>
-        <w:t>descricao</w:t>
-      </w:r>
-      <w:proofErr w:type="spellEnd"/>
-      <w:r>
-        <w:rPr>
-          <w:rFonts w:ascii="Arial" w:hAnsi="Arial"/>
-        </w:rPr>
-        <w:t>, !</w:t>
-      </w:r>
-      <w:proofErr w:type="spellStart"/>
-      <w:r>
-        <w:rPr>
-          <w:rFonts w:ascii="Arial" w:hAnsi="Arial"/>
-        </w:rPr>
-        <w:t>preco</w:t>
-      </w:r>
-      <w:proofErr w:type="spellEnd"/>
-      <w:r>
-        <w:rPr>
-          <w:rFonts w:ascii="Arial" w:hAnsi="Arial"/>
-        </w:rPr>
-        <w:t>, !categoria, !</w:t>
-      </w:r>
-      <w:proofErr w:type="spellStart"/>
-      <w:r>
-        <w:rPr>
-          <w:rFonts w:ascii="Arial" w:hAnsi="Arial"/>
-        </w:rPr>
-        <w:t>disponivel</w:t>
-      </w:r>
-      <w:proofErr w:type="spellEnd"/>
-      <w:proofErr w:type="gramEnd"/>
-      <w:r>
-        <w:rPr>
-          <w:rFonts w:ascii="Arial" w:hAnsi="Arial"/>
-        </w:rPr>
-        <w:t>)) {</w:t>
-      </w:r>
-    </w:p>
-    <w:p>
-      <w:pPr>
-        <w:rPr>
-          <w:rFonts w:ascii="Arial" w:hAnsi="Arial"/>
-        </w:rPr>
-      </w:pPr>
-      <w:r>
-        <w:rPr>
-          <w:rFonts w:ascii="Arial" w:hAnsi="Arial"/>
-        </w:rPr>
-        <w:t xml:space="preserve">      </w:t>
-      </w:r>
-      <w:proofErr w:type="spellStart"/>
-      <w:r>
-        <w:rPr>
-          <w:rFonts w:ascii="Arial" w:hAnsi="Arial"/>
-        </w:rPr>
-        <w:t>return</w:t>
-      </w:r>
-      <w:proofErr w:type="spellEnd"/>
-      <w:r>
-        <w:rPr>
-          <w:rFonts w:ascii="Arial" w:hAnsi="Arial"/>
-        </w:rPr>
-        <w:t xml:space="preserve"> </w:t>
-      </w:r>
-      <w:proofErr w:type="spellStart"/>
-      <w:proofErr w:type="gramStart"/>
+      <w:proofErr w:type="spellStart"/>
       <w:r>
         <w:rPr>
           <w:rFonts w:ascii="Arial" w:hAnsi="Arial"/>
@@ -2504,19 +2468,11 @@
         <w:t>res.status</w:t>
       </w:r>
       <w:proofErr w:type="spellEnd"/>
-      <w:proofErr w:type="gramEnd"/>
-      <w:r>
-        <w:rPr>
-          <w:rFonts w:ascii="Arial" w:hAnsi="Arial"/>
-        </w:rPr>
-        <w:t>(400</w:t>
-      </w:r>
-      <w:proofErr w:type="gramStart"/>
-      <w:r>
-        <w:rPr>
-          <w:rFonts w:ascii="Arial" w:hAnsi="Arial"/>
-        </w:rPr>
-        <w:t>).</w:t>
+      <w:r>
+        <w:rPr>
+          <w:rFonts w:ascii="Arial" w:hAnsi="Arial"/>
+        </w:rPr>
+        <w:t>(400).</w:t>
       </w:r>
       <w:proofErr w:type="spellStart"/>
       <w:r>
@@ -2526,7 +2482,6 @@
         <w:t>json</w:t>
       </w:r>
       <w:proofErr w:type="spellEnd"/>
-      <w:proofErr w:type="gramEnd"/>
       <w:r>
         <w:rPr>
           <w:rFonts w:ascii="Arial" w:hAnsi="Arial"/>
@@ -2579,30 +2534,224 @@
           <w:rFonts w:ascii="Arial" w:hAnsi="Arial"/>
           <w:lang w:val="en-US"/>
         </w:rPr>
-        <w:t>}</w:t>
-      </w:r>
-      <w:proofErr w:type="gramStart"/>
-      <w:r>
+        <w:t>});</w:t>
+      </w:r>
+    </w:p>
+    <w:p>
+      <w:pPr>
         <w:rPr>
           <w:rFonts w:ascii="Arial" w:hAnsi="Arial"/>
           <w:lang w:val="en-US"/>
         </w:rPr>
-        <w:t>);</w:t>
-      </w:r>
-      <w:proofErr w:type="gramEnd"/>
-    </w:p>
-    <w:p>
-      <w:pPr>
+      </w:pPr>
+      <w:r>
         <w:rPr>
           <w:rFonts w:ascii="Arial" w:hAnsi="Arial"/>
           <w:lang w:val="en-US"/>
         </w:rPr>
-      </w:pPr>
-      <w:r>
+        <w:t>    }</w:t>
+      </w:r>
+    </w:p>
+    <w:p>
+      <w:pPr>
         <w:rPr>
           <w:rFonts w:ascii="Arial" w:hAnsi="Arial"/>
           <w:lang w:val="en-US"/>
         </w:rPr>
+      </w:pPr>
+    </w:p>
+    <w:p>
+      <w:pPr>
+        <w:rPr>
+          <w:rFonts w:ascii="Arial" w:hAnsi="Arial"/>
+          <w:lang w:val="en-US"/>
+        </w:rPr>
+      </w:pPr>
+      <w:r>
+        <w:rPr>
+          <w:rFonts w:ascii="Arial" w:hAnsi="Arial"/>
+          <w:lang w:val="en-US"/>
+        </w:rPr>
+        <w:t>    if (</w:t>
+      </w:r>
+      <w:proofErr w:type="spellStart"/>
+      <w:r>
+        <w:rPr>
+          <w:rFonts w:ascii="Arial" w:hAnsi="Arial"/>
+          <w:lang w:val="en-US"/>
+        </w:rPr>
+        <w:t>typeof</w:t>
+      </w:r>
+      <w:proofErr w:type="spellEnd"/>
+      <w:r>
+        <w:rPr>
+          <w:rFonts w:ascii="Arial" w:hAnsi="Arial"/>
+          <w:lang w:val="en-US"/>
+        </w:rPr>
+        <w:t xml:space="preserve"> </w:t>
+      </w:r>
+      <w:proofErr w:type="spellStart"/>
+      <w:r>
+        <w:rPr>
+          <w:rFonts w:ascii="Arial" w:hAnsi="Arial"/>
+          <w:lang w:val="en-US"/>
+        </w:rPr>
+        <w:t>preco</w:t>
+      </w:r>
+      <w:proofErr w:type="spellEnd"/>
+      <w:r>
+        <w:rPr>
+          <w:rFonts w:ascii="Arial" w:hAnsi="Arial"/>
+          <w:lang w:val="en-US"/>
+        </w:rPr>
+        <w:t xml:space="preserve"> !== "number" || </w:t>
+      </w:r>
+      <w:proofErr w:type="spellStart"/>
+      <w:r>
+        <w:rPr>
+          <w:rFonts w:ascii="Arial" w:hAnsi="Arial"/>
+          <w:lang w:val="en-US"/>
+        </w:rPr>
+        <w:t>preco</w:t>
+      </w:r>
+      <w:proofErr w:type="spellEnd"/>
+      <w:r>
+        <w:rPr>
+          <w:rFonts w:ascii="Arial" w:hAnsi="Arial"/>
+          <w:lang w:val="en-US"/>
+        </w:rPr>
+        <w:t xml:space="preserve"> &lt;= 0) {</w:t>
+      </w:r>
+    </w:p>
+    <w:p>
+      <w:pPr>
+        <w:rPr>
+          <w:rFonts w:ascii="Arial" w:hAnsi="Arial"/>
+        </w:rPr>
+      </w:pPr>
+      <w:r>
+        <w:rPr>
+          <w:rFonts w:ascii="Arial" w:hAnsi="Arial"/>
+          <w:lang w:val="en-US"/>
+        </w:rPr>
+        <w:t xml:space="preserve">      </w:t>
+      </w:r>
+      <w:proofErr w:type="spellStart"/>
+      <w:r>
+        <w:rPr>
+          <w:rFonts w:ascii="Arial" w:hAnsi="Arial"/>
+        </w:rPr>
+        <w:t>return</w:t>
+      </w:r>
+      <w:proofErr w:type="spellEnd"/>
+      <w:r>
+        <w:rPr>
+          <w:rFonts w:ascii="Arial" w:hAnsi="Arial"/>
+        </w:rPr>
+        <w:t xml:space="preserve"> </w:t>
+      </w:r>
+      <w:proofErr w:type="spellStart"/>
+      <w:r>
+        <w:rPr>
+          <w:rFonts w:ascii="Arial" w:hAnsi="Arial"/>
+        </w:rPr>
+        <w:t>res.status</w:t>
+      </w:r>
+      <w:proofErr w:type="spellEnd"/>
+      <w:r>
+        <w:rPr>
+          <w:rFonts w:ascii="Arial" w:hAnsi="Arial"/>
+        </w:rPr>
+        <w:t>(400).</w:t>
+      </w:r>
+      <w:proofErr w:type="spellStart"/>
+      <w:r>
+        <w:rPr>
+          <w:rFonts w:ascii="Arial" w:hAnsi="Arial"/>
+        </w:rPr>
+        <w:t>json</w:t>
+      </w:r>
+      <w:proofErr w:type="spellEnd"/>
+      <w:r>
+        <w:rPr>
+          <w:rFonts w:ascii="Arial" w:hAnsi="Arial"/>
+        </w:rPr>
+        <w:t>({</w:t>
+      </w:r>
+    </w:p>
+    <w:p>
+      <w:pPr>
+        <w:rPr>
+          <w:rFonts w:ascii="Arial" w:hAnsi="Arial"/>
+        </w:rPr>
+      </w:pPr>
+      <w:r>
+        <w:rPr>
+          <w:rFonts w:ascii="Arial" w:hAnsi="Arial"/>
+        </w:rPr>
+        <w:t>        sucesso: false,</w:t>
+      </w:r>
+    </w:p>
+    <w:p>
+      <w:pPr>
+        <w:rPr>
+          <w:rFonts w:ascii="Arial" w:hAnsi="Arial"/>
+        </w:rPr>
+      </w:pPr>
+      <w:r>
+        <w:rPr>
+          <w:rFonts w:ascii="Arial" w:hAnsi="Arial"/>
+        </w:rPr>
+        <w:t>        mensagem: "</w:t>
+      </w:r>
+      <w:proofErr w:type="spellStart"/>
+      <w:r>
+        <w:rPr>
+          <w:rFonts w:ascii="Arial" w:hAnsi="Arial"/>
+        </w:rPr>
+        <w:t>preco</w:t>
+      </w:r>
+      <w:proofErr w:type="spellEnd"/>
+      <w:r>
+        <w:rPr>
+          <w:rFonts w:ascii="Arial" w:hAnsi="Arial"/>
+        </w:rPr>
+        <w:t xml:space="preserve"> deve ser um número positivo.",</w:t>
+      </w:r>
+    </w:p>
+    <w:p>
+      <w:pPr>
+        <w:rPr>
+          <w:rFonts w:ascii="Arial" w:hAnsi="Arial"/>
+          <w:lang w:val="en-US"/>
+        </w:rPr>
+      </w:pPr>
+      <w:r>
+        <w:rPr>
+          <w:rFonts w:ascii="Arial" w:hAnsi="Arial"/>
+        </w:rPr>
+        <w:t xml:space="preserve">      </w:t>
+      </w:r>
+      <w:r>
+        <w:rPr>
+          <w:rFonts w:ascii="Arial" w:hAnsi="Arial"/>
+          <w:lang w:val="en-US"/>
+        </w:rPr>
+        <w:t>});</w:t>
+      </w:r>
+    </w:p>
+    <w:p>
+      <w:pPr>
+        <w:rPr>
+          <w:rFonts w:ascii="Arial" w:hAnsi="Arial"/>
+          <w:lang w:val="en-US"/>
+        </w:rPr>
+      </w:pPr>
+      <w:r>
+        <w:rPr>
+          <w:rFonts w:ascii="Arial" w:hAnsi="Arial"/>
+          <w:lang w:val="en-US"/>
+        </w:rPr>
         <w:t>    }</w:t>
       </w:r>
     </w:p>
@@ -2645,29 +2794,426 @@
         <w:t xml:space="preserve"> </w:t>
       </w:r>
       <w:proofErr w:type="spellStart"/>
-      <w:proofErr w:type="gramStart"/>
       <w:r>
         <w:rPr>
           <w:rFonts w:ascii="Arial" w:hAnsi="Arial"/>
           <w:lang w:val="en-US"/>
         </w:rPr>
+        <w:t>disponivel</w:t>
+      </w:r>
+      <w:proofErr w:type="spellEnd"/>
+      <w:r>
+        <w:rPr>
+          <w:rFonts w:ascii="Arial" w:hAnsi="Arial"/>
+          <w:lang w:val="en-US"/>
+        </w:rPr>
+        <w:t xml:space="preserve"> !== "</w:t>
+      </w:r>
+      <w:proofErr w:type="spellStart"/>
+      <w:r>
+        <w:rPr>
+          <w:rFonts w:ascii="Arial" w:hAnsi="Arial"/>
+          <w:lang w:val="en-US"/>
+        </w:rPr>
+        <w:t>boolean</w:t>
+      </w:r>
+      <w:proofErr w:type="spellEnd"/>
+      <w:r>
+        <w:rPr>
+          <w:rFonts w:ascii="Arial" w:hAnsi="Arial"/>
+          <w:lang w:val="en-US"/>
+        </w:rPr>
+        <w:t>") {</w:t>
+      </w:r>
+    </w:p>
+    <w:p>
+      <w:pPr>
+        <w:rPr>
+          <w:rFonts w:ascii="Arial" w:hAnsi="Arial"/>
+          <w:lang w:val="en-US"/>
+        </w:rPr>
+      </w:pPr>
+      <w:r>
+        <w:rPr>
+          <w:rFonts w:ascii="Arial" w:hAnsi="Arial"/>
+          <w:lang w:val="en-US"/>
+        </w:rPr>
+        <w:t xml:space="preserve">      return </w:t>
+      </w:r>
+      <w:proofErr w:type="spellStart"/>
+      <w:r>
+        <w:rPr>
+          <w:rFonts w:ascii="Arial" w:hAnsi="Arial"/>
+          <w:lang w:val="en-US"/>
+        </w:rPr>
+        <w:t>res.status</w:t>
+      </w:r>
+      <w:proofErr w:type="spellEnd"/>
+      <w:r>
+        <w:rPr>
+          <w:rFonts w:ascii="Arial" w:hAnsi="Arial"/>
+          <w:lang w:val="en-US"/>
+        </w:rPr>
+        <w:t>(400).</w:t>
+      </w:r>
+      <w:proofErr w:type="spellStart"/>
+      <w:r>
+        <w:rPr>
+          <w:rFonts w:ascii="Arial" w:hAnsi="Arial"/>
+          <w:lang w:val="en-US"/>
+        </w:rPr>
+        <w:t>json</w:t>
+      </w:r>
+      <w:proofErr w:type="spellEnd"/>
+      <w:r>
+        <w:rPr>
+          <w:rFonts w:ascii="Arial" w:hAnsi="Arial"/>
+          <w:lang w:val="en-US"/>
+        </w:rPr>
+        <w:t>({</w:t>
+      </w:r>
+    </w:p>
+    <w:p>
+      <w:pPr>
+        <w:rPr>
+          <w:rFonts w:ascii="Arial" w:hAnsi="Arial"/>
+          <w:lang w:val="en-US"/>
+        </w:rPr>
+      </w:pPr>
+      <w:r>
+        <w:rPr>
+          <w:rFonts w:ascii="Arial" w:hAnsi="Arial"/>
+          <w:lang w:val="en-US"/>
+        </w:rPr>
+        <w:t xml:space="preserve">        </w:t>
+      </w:r>
+      <w:proofErr w:type="spellStart"/>
+      <w:r>
+        <w:rPr>
+          <w:rFonts w:ascii="Arial" w:hAnsi="Arial"/>
+          <w:lang w:val="en-US"/>
+        </w:rPr>
+        <w:t>sucesso</w:t>
+      </w:r>
+      <w:proofErr w:type="spellEnd"/>
+      <w:r>
+        <w:rPr>
+          <w:rFonts w:ascii="Arial" w:hAnsi="Arial"/>
+          <w:lang w:val="en-US"/>
+        </w:rPr>
+        <w:t>: false,</w:t>
+      </w:r>
+    </w:p>
+    <w:p>
+      <w:pPr>
+        <w:rPr>
+          <w:rFonts w:ascii="Arial" w:hAnsi="Arial"/>
+        </w:rPr>
+      </w:pPr>
+      <w:r>
+        <w:rPr>
+          <w:rFonts w:ascii="Arial" w:hAnsi="Arial"/>
+          <w:lang w:val="en-US"/>
+        </w:rPr>
+        <w:t xml:space="preserve">        </w:t>
+      </w:r>
+      <w:r>
+        <w:rPr>
+          <w:rFonts w:ascii="Arial" w:hAnsi="Arial"/>
+        </w:rPr>
+        <w:t>mensagem: "</w:t>
+      </w:r>
+      <w:proofErr w:type="spellStart"/>
+      <w:r>
+        <w:rPr>
+          <w:rFonts w:ascii="Arial" w:hAnsi="Arial"/>
+        </w:rPr>
+        <w:t>disponivel</w:t>
+      </w:r>
+      <w:proofErr w:type="spellEnd"/>
+      <w:r>
+        <w:rPr>
+          <w:rFonts w:ascii="Arial" w:hAnsi="Arial"/>
+        </w:rPr>
+        <w:t xml:space="preserve"> deve ser </w:t>
+      </w:r>
+      <w:proofErr w:type="spellStart"/>
+      <w:r>
+        <w:rPr>
+          <w:rFonts w:ascii="Arial" w:hAnsi="Arial"/>
+        </w:rPr>
+        <w:t>true</w:t>
+      </w:r>
+      <w:proofErr w:type="spellEnd"/>
+      <w:r>
+        <w:rPr>
+          <w:rFonts w:ascii="Arial" w:hAnsi="Arial"/>
+        </w:rPr>
+        <w:t xml:space="preserve"> ou false",</w:t>
+      </w:r>
+    </w:p>
+    <w:p>
+      <w:pPr>
+        <w:rPr>
+          <w:rFonts w:ascii="Arial" w:hAnsi="Arial"/>
+        </w:rPr>
+      </w:pPr>
+      <w:r>
+        <w:rPr>
+          <w:rFonts w:ascii="Arial" w:hAnsi="Arial"/>
+        </w:rPr>
+        <w:t>      });</w:t>
+      </w:r>
+    </w:p>
+    <w:p>
+      <w:pPr>
+        <w:rPr>
+          <w:rFonts w:ascii="Arial" w:hAnsi="Arial"/>
+        </w:rPr>
+      </w:pPr>
+      <w:r>
+        <w:rPr>
+          <w:rFonts w:ascii="Arial" w:hAnsi="Arial"/>
+        </w:rPr>
+        <w:t>    }</w:t>
+      </w:r>
+    </w:p>
+    <w:p>
+      <w:pPr>
+        <w:rPr>
+          <w:rFonts w:ascii="Arial" w:hAnsi="Arial"/>
+        </w:rPr>
+      </w:pPr>
+    </w:p>
+    <w:p>
+      <w:pPr>
+        <w:rPr>
+          <w:rFonts w:ascii="Arial" w:hAnsi="Arial"/>
+        </w:rPr>
+      </w:pPr>
+      <w:r>
+        <w:rPr>
+          <w:rFonts w:ascii="Arial" w:hAnsi="Arial"/>
+        </w:rPr>
+        <w:t xml:space="preserve">    </w:t>
+      </w:r>
+      <w:proofErr w:type="spellStart"/>
+      <w:r>
+        <w:rPr>
+          <w:rFonts w:ascii="Arial" w:hAnsi="Arial"/>
+        </w:rPr>
+        <w:t>const</w:t>
+      </w:r>
+      <w:proofErr w:type="spellEnd"/>
+      <w:r>
+        <w:rPr>
+          <w:rFonts w:ascii="Arial" w:hAnsi="Arial"/>
+        </w:rPr>
+        <w:t xml:space="preserve"> </w:t>
+      </w:r>
+      <w:proofErr w:type="spellStart"/>
+      <w:r>
+        <w:rPr>
+          <w:rFonts w:ascii="Arial" w:hAnsi="Arial"/>
+        </w:rPr>
+        <w:t>novoProduto</w:t>
+      </w:r>
+      <w:proofErr w:type="spellEnd"/>
+      <w:r>
+        <w:rPr>
+          <w:rFonts w:ascii="Arial" w:hAnsi="Arial"/>
+        </w:rPr>
+        <w:t xml:space="preserve"> = {</w:t>
+      </w:r>
+    </w:p>
+    <w:p>
+      <w:pPr>
+        <w:rPr>
+          <w:rFonts w:ascii="Arial" w:hAnsi="Arial"/>
+        </w:rPr>
+      </w:pPr>
+      <w:r>
+        <w:rPr>
+          <w:rFonts w:ascii="Arial" w:hAnsi="Arial"/>
+        </w:rPr>
+        <w:t xml:space="preserve">      nome: </w:t>
+      </w:r>
+      <w:proofErr w:type="spellStart"/>
+      <w:r>
+        <w:rPr>
+          <w:rFonts w:ascii="Arial" w:hAnsi="Arial"/>
+        </w:rPr>
+        <w:t>nome.trim</w:t>
+      </w:r>
+      <w:proofErr w:type="spellEnd"/>
+      <w:r>
+        <w:rPr>
+          <w:rFonts w:ascii="Arial" w:hAnsi="Arial"/>
+        </w:rPr>
+        <w:t>(),</w:t>
+      </w:r>
+    </w:p>
+    <w:p>
+      <w:pPr>
+        <w:rPr>
+          <w:rFonts w:ascii="Arial" w:hAnsi="Arial"/>
+        </w:rPr>
+      </w:pPr>
+      <w:r>
+        <w:rPr>
+          <w:rFonts w:ascii="Arial" w:hAnsi="Arial"/>
+        </w:rPr>
+        <w:t xml:space="preserve">      </w:t>
+      </w:r>
+      <w:proofErr w:type="spellStart"/>
+      <w:r>
+        <w:rPr>
+          <w:rFonts w:ascii="Arial" w:hAnsi="Arial"/>
+        </w:rPr>
+        <w:t>descricao</w:t>
+      </w:r>
+      <w:proofErr w:type="spellEnd"/>
+      <w:r>
+        <w:rPr>
+          <w:rFonts w:ascii="Arial" w:hAnsi="Arial"/>
+        </w:rPr>
+        <w:t xml:space="preserve">: </w:t>
+      </w:r>
+      <w:proofErr w:type="spellStart"/>
+      <w:r>
+        <w:rPr>
+          <w:rFonts w:ascii="Arial" w:hAnsi="Arial"/>
+        </w:rPr>
+        <w:t>descricao.trim</w:t>
+      </w:r>
+      <w:proofErr w:type="spellEnd"/>
+      <w:r>
+        <w:rPr>
+          <w:rFonts w:ascii="Arial" w:hAnsi="Arial"/>
+        </w:rPr>
+        <w:t>(),</w:t>
+      </w:r>
+    </w:p>
+    <w:p>
+      <w:pPr>
+        <w:rPr>
+          <w:rFonts w:ascii="Arial" w:hAnsi="Arial"/>
+        </w:rPr>
+      </w:pPr>
+      <w:r>
+        <w:rPr>
+          <w:rFonts w:ascii="Arial" w:hAnsi="Arial"/>
+        </w:rPr>
+        <w:t xml:space="preserve">      </w:t>
+      </w:r>
+      <w:proofErr w:type="spellStart"/>
+      <w:r>
+        <w:rPr>
+          <w:rFonts w:ascii="Arial" w:hAnsi="Arial"/>
+        </w:rPr>
         <w:t>preco</w:t>
       </w:r>
       <w:proofErr w:type="spellEnd"/>
       <w:r>
         <w:rPr>
           <w:rFonts w:ascii="Arial" w:hAnsi="Arial"/>
+        </w:rPr>
+        <w:t>,</w:t>
+      </w:r>
+    </w:p>
+    <w:p>
+      <w:pPr>
+        <w:rPr>
+          <w:rFonts w:ascii="Arial" w:hAnsi="Arial"/>
+        </w:rPr>
+      </w:pPr>
+      <w:r>
+        <w:rPr>
+          <w:rFonts w:ascii="Arial" w:hAnsi="Arial"/>
+        </w:rPr>
+        <w:t xml:space="preserve">      categoria: </w:t>
+      </w:r>
+      <w:proofErr w:type="spellStart"/>
+      <w:r>
+        <w:rPr>
+          <w:rFonts w:ascii="Arial" w:hAnsi="Arial"/>
+        </w:rPr>
+        <w:t>categoria.trim</w:t>
+      </w:r>
+      <w:proofErr w:type="spellEnd"/>
+      <w:r>
+        <w:rPr>
+          <w:rFonts w:ascii="Arial" w:hAnsi="Arial"/>
+        </w:rPr>
+        <w:t>(),</w:t>
+      </w:r>
+    </w:p>
+    <w:p>
+      <w:pPr>
+        <w:rPr>
+          <w:rFonts w:ascii="Arial" w:hAnsi="Arial"/>
+        </w:rPr>
+      </w:pPr>
+      <w:r>
+        <w:rPr>
+          <w:rFonts w:ascii="Arial" w:hAnsi="Arial"/>
+        </w:rPr>
+        <w:t xml:space="preserve">      </w:t>
+      </w:r>
+      <w:proofErr w:type="spellStart"/>
+      <w:r>
+        <w:rPr>
+          <w:rFonts w:ascii="Arial" w:hAnsi="Arial"/>
+        </w:rPr>
+        <w:t>disponivel</w:t>
+      </w:r>
+      <w:proofErr w:type="spellEnd"/>
+      <w:r>
+        <w:rPr>
+          <w:rFonts w:ascii="Arial" w:hAnsi="Arial"/>
+        </w:rPr>
+        <w:t>,</w:t>
+      </w:r>
+    </w:p>
+    <w:p>
+      <w:pPr>
+        <w:rPr>
+          <w:rFonts w:ascii="Arial" w:hAnsi="Arial"/>
+        </w:rPr>
+      </w:pPr>
+      <w:r>
+        <w:rPr>
+          <w:rFonts w:ascii="Arial" w:hAnsi="Arial"/>
+        </w:rPr>
+        <w:t>    };</w:t>
+      </w:r>
+    </w:p>
+    <w:p>
+      <w:pPr>
+        <w:rPr>
+          <w:rFonts w:ascii="Arial" w:hAnsi="Arial"/>
+        </w:rPr>
+      </w:pPr>
+    </w:p>
+    <w:p>
+      <w:pPr>
+        <w:rPr>
+          <w:rFonts w:ascii="Arial" w:hAnsi="Arial"/>
           <w:lang w:val="en-US"/>
         </w:rPr>
-        <w:t xml:space="preserve"> !</w:t>
-      </w:r>
-      <w:proofErr w:type="gramEnd"/>
+      </w:pPr>
+      <w:r>
+        <w:rPr>
+          <w:rFonts w:ascii="Arial" w:hAnsi="Arial"/>
+        </w:rPr>
+        <w:t xml:space="preserve">    </w:t>
+      </w:r>
       <w:r>
         <w:rPr>
           <w:rFonts w:ascii="Arial" w:hAnsi="Arial"/>
           <w:lang w:val="en-US"/>
         </w:rPr>
-        <w:t xml:space="preserve">== "number" || </w:t>
+        <w:t xml:space="preserve">const </w:t>
       </w:r>
       <w:proofErr w:type="spellStart"/>
       <w:r>
@@ -2675,7 +3221,7 @@
           <w:rFonts w:ascii="Arial" w:hAnsi="Arial"/>
           <w:lang w:val="en-US"/>
         </w:rPr>
-        <w:t>preco</w:t>
+        <w:t>resultado</w:t>
       </w:r>
       <w:proofErr w:type="spellEnd"/>
       <w:r>
@@ -2683,694 +3229,51 @@
           <w:rFonts w:ascii="Arial" w:hAnsi="Arial"/>
           <w:lang w:val="en-US"/>
         </w:rPr>
-        <w:t xml:space="preserve"> &lt;= 0) {</w:t>
-      </w:r>
-    </w:p>
-    <w:p>
-      <w:pPr>
-        <w:rPr>
-          <w:rFonts w:ascii="Arial" w:hAnsi="Arial"/>
-        </w:rPr>
-      </w:pPr>
+        <w:t xml:space="preserve"> = await </w:t>
+      </w:r>
+      <w:proofErr w:type="spellStart"/>
       <w:r>
         <w:rPr>
           <w:rFonts w:ascii="Arial" w:hAnsi="Arial"/>
           <w:lang w:val="en-US"/>
         </w:rPr>
-        <w:t xml:space="preserve">      </w:t>
-      </w:r>
-      <w:proofErr w:type="spellStart"/>
-      <w:r>
-        <w:rPr>
-          <w:rFonts w:ascii="Arial" w:hAnsi="Arial"/>
-        </w:rPr>
-        <w:t>return</w:t>
-      </w:r>
-      <w:proofErr w:type="spellEnd"/>
-      <w:r>
-        <w:rPr>
-          <w:rFonts w:ascii="Arial" w:hAnsi="Arial"/>
-        </w:rPr>
-        <w:t xml:space="preserve"> </w:t>
-      </w:r>
-      <w:proofErr w:type="spellStart"/>
-      <w:proofErr w:type="gramStart"/>
-      <w:r>
-        <w:rPr>
-          <w:rFonts w:ascii="Arial" w:hAnsi="Arial"/>
-        </w:rPr>
-        <w:t>res.status</w:t>
-      </w:r>
-      <w:proofErr w:type="spellEnd"/>
-      <w:proofErr w:type="gramEnd"/>
-      <w:r>
-        <w:rPr>
-          <w:rFonts w:ascii="Arial" w:hAnsi="Arial"/>
-        </w:rPr>
-        <w:t>(400</w:t>
-      </w:r>
-      <w:proofErr w:type="gramStart"/>
-      <w:r>
-        <w:rPr>
-          <w:rFonts w:ascii="Arial" w:hAnsi="Arial"/>
-        </w:rPr>
-        <w:t>).</w:t>
-      </w:r>
-      <w:proofErr w:type="spellStart"/>
-      <w:r>
-        <w:rPr>
-          <w:rFonts w:ascii="Arial" w:hAnsi="Arial"/>
-        </w:rPr>
-        <w:t>json</w:t>
-      </w:r>
-      <w:proofErr w:type="spellEnd"/>
-      <w:proofErr w:type="gramEnd"/>
-      <w:r>
-        <w:rPr>
-          <w:rFonts w:ascii="Arial" w:hAnsi="Arial"/>
-        </w:rPr>
-        <w:t>({</w:t>
-      </w:r>
-    </w:p>
-    <w:p>
-      <w:pPr>
-        <w:rPr>
-          <w:rFonts w:ascii="Arial" w:hAnsi="Arial"/>
-        </w:rPr>
-      </w:pPr>
-      <w:r>
-        <w:rPr>
-          <w:rFonts w:ascii="Arial" w:hAnsi="Arial"/>
-        </w:rPr>
-        <w:t>        sucesso: false,</w:t>
-      </w:r>
-    </w:p>
-    <w:p>
-      <w:pPr>
-        <w:rPr>
-          <w:rFonts w:ascii="Arial" w:hAnsi="Arial"/>
-        </w:rPr>
-      </w:pPr>
-      <w:r>
-        <w:rPr>
-          <w:rFonts w:ascii="Arial" w:hAnsi="Arial"/>
-        </w:rPr>
-        <w:t>        mensagem: "</w:t>
-      </w:r>
-      <w:proofErr w:type="spellStart"/>
-      <w:r>
-        <w:rPr>
-          <w:rFonts w:ascii="Arial" w:hAnsi="Arial"/>
-        </w:rPr>
-        <w:t>preco</w:t>
-      </w:r>
-      <w:proofErr w:type="spellEnd"/>
-      <w:r>
-        <w:rPr>
-          <w:rFonts w:ascii="Arial" w:hAnsi="Arial"/>
-        </w:rPr>
-        <w:t xml:space="preserve"> deve ser um número positivo.",</w:t>
-      </w:r>
-    </w:p>
-    <w:p>
-      <w:pPr>
+        <w:t>queryAsync</w:t>
+      </w:r>
+      <w:proofErr w:type="spellEnd"/>
+      <w:r>
         <w:rPr>
           <w:rFonts w:ascii="Arial" w:hAnsi="Arial"/>
           <w:lang w:val="en-US"/>
         </w:rPr>
-      </w:pPr>
-      <w:r>
-        <w:rPr>
-          <w:rFonts w:ascii="Arial" w:hAnsi="Arial"/>
-        </w:rPr>
-        <w:t xml:space="preserve">      </w:t>
-      </w:r>
+        <w:t xml:space="preserve">("INSERT INTO </w:t>
+      </w:r>
+      <w:proofErr w:type="spellStart"/>
       <w:r>
         <w:rPr>
           <w:rFonts w:ascii="Arial" w:hAnsi="Arial"/>
           <w:lang w:val="en-US"/>
         </w:rPr>
-        <w:t>}</w:t>
-      </w:r>
-      <w:proofErr w:type="gramStart"/>
+        <w:t>produto</w:t>
+      </w:r>
+      <w:proofErr w:type="spellEnd"/>
       <w:r>
         <w:rPr>
           <w:rFonts w:ascii="Arial" w:hAnsi="Arial"/>
           <w:lang w:val="en-US"/>
         </w:rPr>
-        <w:t>);</w:t>
-      </w:r>
-      <w:proofErr w:type="gramEnd"/>
-    </w:p>
-    <w:p>
-      <w:pPr>
+        <w:t xml:space="preserve"> SET ?", [</w:t>
+      </w:r>
+    </w:p>
+    <w:p>
+      <w:pPr>
+        <w:rPr>
+          <w:rFonts w:ascii="Arial" w:hAnsi="Arial"/>
+        </w:rPr>
+      </w:pPr>
+      <w:r>
         <w:rPr>
           <w:rFonts w:ascii="Arial" w:hAnsi="Arial"/>
           <w:lang w:val="en-US"/>
-        </w:rPr>
-      </w:pPr>
-      <w:r>
-        <w:rPr>
-          <w:rFonts w:ascii="Arial" w:hAnsi="Arial"/>
-          <w:lang w:val="en-US"/>
-        </w:rPr>
-        <w:t>    }</w:t>
-      </w:r>
-    </w:p>
-    <w:p>
-      <w:pPr>
-        <w:rPr>
-          <w:rFonts w:ascii="Arial" w:hAnsi="Arial"/>
-          <w:lang w:val="en-US"/>
-        </w:rPr>
-      </w:pPr>
-    </w:p>
-    <w:p>
-      <w:pPr>
-        <w:rPr>
-          <w:rFonts w:ascii="Arial" w:hAnsi="Arial"/>
-          <w:lang w:val="en-US"/>
-        </w:rPr>
-      </w:pPr>
-      <w:r>
-        <w:rPr>
-          <w:rFonts w:ascii="Arial" w:hAnsi="Arial"/>
-          <w:lang w:val="en-US"/>
-        </w:rPr>
-        <w:t>    if (</w:t>
-      </w:r>
-      <w:proofErr w:type="spellStart"/>
-      <w:r>
-        <w:rPr>
-          <w:rFonts w:ascii="Arial" w:hAnsi="Arial"/>
-          <w:lang w:val="en-US"/>
-        </w:rPr>
-        <w:t>typeof</w:t>
-      </w:r>
-      <w:proofErr w:type="spellEnd"/>
-      <w:r>
-        <w:rPr>
-          <w:rFonts w:ascii="Arial" w:hAnsi="Arial"/>
-          <w:lang w:val="en-US"/>
-        </w:rPr>
-        <w:t xml:space="preserve"> </w:t>
-      </w:r>
-      <w:proofErr w:type="spellStart"/>
-      <w:proofErr w:type="gramStart"/>
-      <w:r>
-        <w:rPr>
-          <w:rFonts w:ascii="Arial" w:hAnsi="Arial"/>
-          <w:lang w:val="en-US"/>
-        </w:rPr>
-        <w:t>disponivel</w:t>
-      </w:r>
-      <w:proofErr w:type="spellEnd"/>
-      <w:r>
-        <w:rPr>
-          <w:rFonts w:ascii="Arial" w:hAnsi="Arial"/>
-          <w:lang w:val="en-US"/>
-        </w:rPr>
-        <w:t xml:space="preserve"> !</w:t>
-      </w:r>
-      <w:proofErr w:type="gramEnd"/>
-      <w:r>
-        <w:rPr>
-          <w:rFonts w:ascii="Arial" w:hAnsi="Arial"/>
-          <w:lang w:val="en-US"/>
-        </w:rPr>
-        <w:t>== "</w:t>
-      </w:r>
-      <w:proofErr w:type="spellStart"/>
-      <w:r>
-        <w:rPr>
-          <w:rFonts w:ascii="Arial" w:hAnsi="Arial"/>
-          <w:lang w:val="en-US"/>
-        </w:rPr>
-        <w:t>boolean</w:t>
-      </w:r>
-      <w:proofErr w:type="spellEnd"/>
-      <w:r>
-        <w:rPr>
-          <w:rFonts w:ascii="Arial" w:hAnsi="Arial"/>
-          <w:lang w:val="en-US"/>
-        </w:rPr>
-        <w:t>") {</w:t>
-      </w:r>
-    </w:p>
-    <w:p>
-      <w:pPr>
-        <w:rPr>
-          <w:rFonts w:ascii="Arial" w:hAnsi="Arial"/>
-          <w:lang w:val="en-US"/>
-        </w:rPr>
-      </w:pPr>
-      <w:r>
-        <w:rPr>
-          <w:rFonts w:ascii="Arial" w:hAnsi="Arial"/>
-          <w:lang w:val="en-US"/>
-        </w:rPr>
-        <w:t xml:space="preserve">      return </w:t>
-      </w:r>
-      <w:proofErr w:type="spellStart"/>
-      <w:proofErr w:type="gramStart"/>
-      <w:r>
-        <w:rPr>
-          <w:rFonts w:ascii="Arial" w:hAnsi="Arial"/>
-          <w:lang w:val="en-US"/>
-        </w:rPr>
-        <w:t>res.status</w:t>
-      </w:r>
-      <w:proofErr w:type="spellEnd"/>
-      <w:proofErr w:type="gramEnd"/>
-      <w:r>
-        <w:rPr>
-          <w:rFonts w:ascii="Arial" w:hAnsi="Arial"/>
-          <w:lang w:val="en-US"/>
-        </w:rPr>
-        <w:t>(400</w:t>
-      </w:r>
-      <w:proofErr w:type="gramStart"/>
-      <w:r>
-        <w:rPr>
-          <w:rFonts w:ascii="Arial" w:hAnsi="Arial"/>
-          <w:lang w:val="en-US"/>
-        </w:rPr>
-        <w:t>).</w:t>
-      </w:r>
-      <w:proofErr w:type="spellStart"/>
-      <w:r>
-        <w:rPr>
-          <w:rFonts w:ascii="Arial" w:hAnsi="Arial"/>
-          <w:lang w:val="en-US"/>
-        </w:rPr>
-        <w:t>json</w:t>
-      </w:r>
-      <w:proofErr w:type="spellEnd"/>
-      <w:proofErr w:type="gramEnd"/>
-      <w:r>
-        <w:rPr>
-          <w:rFonts w:ascii="Arial" w:hAnsi="Arial"/>
-          <w:lang w:val="en-US"/>
-        </w:rPr>
-        <w:t>({</w:t>
-      </w:r>
-    </w:p>
-    <w:p>
-      <w:pPr>
-        <w:rPr>
-          <w:rFonts w:ascii="Arial" w:hAnsi="Arial"/>
-        </w:rPr>
-      </w:pPr>
-      <w:r>
-        <w:rPr>
-          <w:rFonts w:ascii="Arial" w:hAnsi="Arial"/>
-          <w:lang w:val="en-US"/>
-        </w:rPr>
-        <w:t xml:space="preserve">        </w:t>
-      </w:r>
-      <w:r>
-        <w:rPr>
-          <w:rFonts w:ascii="Arial" w:hAnsi="Arial"/>
-        </w:rPr>
-        <w:t>sucesso: false,</w:t>
-      </w:r>
-    </w:p>
-    <w:p>
-      <w:pPr>
-        <w:rPr>
-          <w:rFonts w:ascii="Arial" w:hAnsi="Arial"/>
-        </w:rPr>
-      </w:pPr>
-      <w:r>
-        <w:rPr>
-          <w:rFonts w:ascii="Arial" w:hAnsi="Arial"/>
-        </w:rPr>
-        <w:t>        mensagem: "</w:t>
-      </w:r>
-      <w:proofErr w:type="spellStart"/>
-      <w:r>
-        <w:rPr>
-          <w:rFonts w:ascii="Arial" w:hAnsi="Arial"/>
-        </w:rPr>
-        <w:t>disponivel</w:t>
-      </w:r>
-      <w:proofErr w:type="spellEnd"/>
-      <w:r>
-        <w:rPr>
-          <w:rFonts w:ascii="Arial" w:hAnsi="Arial"/>
-        </w:rPr>
-        <w:t xml:space="preserve"> deve ser </w:t>
-      </w:r>
-      <w:proofErr w:type="spellStart"/>
-      <w:r>
-        <w:rPr>
-          <w:rFonts w:ascii="Arial" w:hAnsi="Arial"/>
-        </w:rPr>
-        <w:t>true</w:t>
-      </w:r>
-      <w:proofErr w:type="spellEnd"/>
-      <w:r>
-        <w:rPr>
-          <w:rFonts w:ascii="Arial" w:hAnsi="Arial"/>
-        </w:rPr>
-        <w:t xml:space="preserve"> ou false",</w:t>
-      </w:r>
-    </w:p>
-    <w:p>
-      <w:pPr>
-        <w:rPr>
-          <w:rFonts w:ascii="Arial" w:hAnsi="Arial"/>
-        </w:rPr>
-      </w:pPr>
-      <w:r>
-        <w:rPr>
-          <w:rFonts w:ascii="Arial" w:hAnsi="Arial"/>
-        </w:rPr>
-        <w:t>      });</w:t>
-      </w:r>
-    </w:p>
-    <w:p>
-      <w:pPr>
-        <w:rPr>
-          <w:rFonts w:ascii="Arial" w:hAnsi="Arial"/>
-        </w:rPr>
-      </w:pPr>
-      <w:r>
-        <w:rPr>
-          <w:rFonts w:ascii="Arial" w:hAnsi="Arial"/>
-        </w:rPr>
-        <w:t>    }</w:t>
-      </w:r>
-    </w:p>
-    <w:p>
-      <w:pPr>
-        <w:rPr>
-          <w:rFonts w:ascii="Arial" w:hAnsi="Arial"/>
-        </w:rPr>
-      </w:pPr>
-    </w:p>
-    <w:p>
-      <w:pPr>
-        <w:rPr>
-          <w:rFonts w:ascii="Arial" w:hAnsi="Arial"/>
-        </w:rPr>
-      </w:pPr>
-      <w:r>
-        <w:rPr>
-          <w:rFonts w:ascii="Arial" w:hAnsi="Arial"/>
-        </w:rPr>
-        <w:t xml:space="preserve">    </w:t>
-      </w:r>
-      <w:proofErr w:type="spellStart"/>
-      <w:r>
-        <w:rPr>
-          <w:rFonts w:ascii="Arial" w:hAnsi="Arial"/>
-        </w:rPr>
-        <w:t>const</w:t>
-      </w:r>
-      <w:proofErr w:type="spellEnd"/>
-      <w:r>
-        <w:rPr>
-          <w:rFonts w:ascii="Arial" w:hAnsi="Arial"/>
-        </w:rPr>
-        <w:t xml:space="preserve"> </w:t>
-      </w:r>
-      <w:proofErr w:type="spellStart"/>
-      <w:r>
-        <w:rPr>
-          <w:rFonts w:ascii="Arial" w:hAnsi="Arial"/>
-        </w:rPr>
-        <w:t>novoProduto</w:t>
-      </w:r>
-      <w:proofErr w:type="spellEnd"/>
-      <w:r>
-        <w:rPr>
-          <w:rFonts w:ascii="Arial" w:hAnsi="Arial"/>
-        </w:rPr>
-        <w:t xml:space="preserve"> = {</w:t>
-      </w:r>
-    </w:p>
-    <w:p>
-      <w:pPr>
-        <w:rPr>
-          <w:rFonts w:ascii="Arial" w:hAnsi="Arial"/>
-        </w:rPr>
-      </w:pPr>
-      <w:r>
-        <w:rPr>
-          <w:rFonts w:ascii="Arial" w:hAnsi="Arial"/>
-        </w:rPr>
-        <w:t xml:space="preserve">      nome: </w:t>
-      </w:r>
-      <w:proofErr w:type="spellStart"/>
-      <w:proofErr w:type="gramStart"/>
-      <w:r>
-        <w:rPr>
-          <w:rFonts w:ascii="Arial" w:hAnsi="Arial"/>
-        </w:rPr>
-        <w:t>nome.trim</w:t>
-      </w:r>
-      <w:proofErr w:type="spellEnd"/>
-      <w:proofErr w:type="gramEnd"/>
-      <w:r>
-        <w:rPr>
-          <w:rFonts w:ascii="Arial" w:hAnsi="Arial"/>
-        </w:rPr>
-        <w:t>(),</w:t>
-      </w:r>
-    </w:p>
-    <w:p>
-      <w:pPr>
-        <w:rPr>
-          <w:rFonts w:ascii="Arial" w:hAnsi="Arial"/>
-        </w:rPr>
-      </w:pPr>
-      <w:r>
-        <w:rPr>
-          <w:rFonts w:ascii="Arial" w:hAnsi="Arial"/>
-        </w:rPr>
-        <w:t xml:space="preserve">      </w:t>
-      </w:r>
-      <w:proofErr w:type="spellStart"/>
-      <w:r>
-        <w:rPr>
-          <w:rFonts w:ascii="Arial" w:hAnsi="Arial"/>
-        </w:rPr>
-        <w:t>descricao</w:t>
-      </w:r>
-      <w:proofErr w:type="spellEnd"/>
-      <w:r>
-        <w:rPr>
-          <w:rFonts w:ascii="Arial" w:hAnsi="Arial"/>
-        </w:rPr>
-        <w:t xml:space="preserve">: </w:t>
-      </w:r>
-      <w:proofErr w:type="spellStart"/>
-      <w:proofErr w:type="gramStart"/>
-      <w:r>
-        <w:rPr>
-          <w:rFonts w:ascii="Arial" w:hAnsi="Arial"/>
-        </w:rPr>
-        <w:t>descricao.trim</w:t>
-      </w:r>
-      <w:proofErr w:type="spellEnd"/>
-      <w:proofErr w:type="gramEnd"/>
-      <w:r>
-        <w:rPr>
-          <w:rFonts w:ascii="Arial" w:hAnsi="Arial"/>
-        </w:rPr>
-        <w:t>(),</w:t>
-      </w:r>
-    </w:p>
-    <w:p>
-      <w:pPr>
-        <w:rPr>
-          <w:rFonts w:ascii="Arial" w:hAnsi="Arial"/>
-        </w:rPr>
-      </w:pPr>
-      <w:r>
-        <w:rPr>
-          <w:rFonts w:ascii="Arial" w:hAnsi="Arial"/>
-        </w:rPr>
-        <w:t xml:space="preserve">      </w:t>
-      </w:r>
-      <w:proofErr w:type="spellStart"/>
-      <w:r>
-        <w:rPr>
-          <w:rFonts w:ascii="Arial" w:hAnsi="Arial"/>
-        </w:rPr>
-        <w:t>preco</w:t>
-      </w:r>
-      <w:proofErr w:type="spellEnd"/>
-      <w:r>
-        <w:rPr>
-          <w:rFonts w:ascii="Arial" w:hAnsi="Arial"/>
-        </w:rPr>
-        <w:t>,</w:t>
-      </w:r>
-    </w:p>
-    <w:p>
-      <w:pPr>
-        <w:rPr>
-          <w:rFonts w:ascii="Arial" w:hAnsi="Arial"/>
-        </w:rPr>
-      </w:pPr>
-      <w:r>
-        <w:rPr>
-          <w:rFonts w:ascii="Arial" w:hAnsi="Arial"/>
-        </w:rPr>
-        <w:t xml:space="preserve">      categoria: </w:t>
-      </w:r>
-      <w:proofErr w:type="spellStart"/>
-      <w:proofErr w:type="gramStart"/>
-      <w:r>
-        <w:rPr>
-          <w:rFonts w:ascii="Arial" w:hAnsi="Arial"/>
-        </w:rPr>
-        <w:t>categoria.trim</w:t>
-      </w:r>
-      <w:proofErr w:type="spellEnd"/>
-      <w:proofErr w:type="gramEnd"/>
-      <w:r>
-        <w:rPr>
-          <w:rFonts w:ascii="Arial" w:hAnsi="Arial"/>
-        </w:rPr>
-        <w:t>(),</w:t>
-      </w:r>
-    </w:p>
-    <w:p>
-      <w:pPr>
-        <w:rPr>
-          <w:rFonts w:ascii="Arial" w:hAnsi="Arial"/>
-        </w:rPr>
-      </w:pPr>
-      <w:r>
-        <w:rPr>
-          <w:rFonts w:ascii="Arial" w:hAnsi="Arial"/>
-        </w:rPr>
-        <w:t xml:space="preserve">      </w:t>
-      </w:r>
-      <w:proofErr w:type="spellStart"/>
-      <w:r>
-        <w:rPr>
-          <w:rFonts w:ascii="Arial" w:hAnsi="Arial"/>
-        </w:rPr>
-        <w:t>disponivel</w:t>
-      </w:r>
-      <w:proofErr w:type="spellEnd"/>
-      <w:r>
-        <w:rPr>
-          <w:rFonts w:ascii="Arial" w:hAnsi="Arial"/>
-        </w:rPr>
-        <w:t>,</w:t>
-      </w:r>
-    </w:p>
-    <w:p>
-      <w:pPr>
-        <w:rPr>
-          <w:rFonts w:ascii="Arial" w:hAnsi="Arial"/>
-        </w:rPr>
-      </w:pPr>
-      <w:r>
-        <w:rPr>
-          <w:rFonts w:ascii="Arial" w:hAnsi="Arial"/>
-        </w:rPr>
-        <w:t>    };</w:t>
-      </w:r>
-    </w:p>
-    <w:p>
-      <w:pPr>
-        <w:rPr>
-          <w:rFonts w:ascii="Arial" w:hAnsi="Arial"/>
-        </w:rPr>
-      </w:pPr>
-    </w:p>
-    <w:p>
-      <w:pPr>
-        <w:rPr>
-          <w:rFonts w:ascii="Arial" w:hAnsi="Arial"/>
-        </w:rPr>
-      </w:pPr>
-      <w:r>
-        <w:rPr>
-          <w:rFonts w:ascii="Arial" w:hAnsi="Arial"/>
-        </w:rPr>
-        <w:t xml:space="preserve">    </w:t>
-      </w:r>
-      <w:proofErr w:type="spellStart"/>
-      <w:r>
-        <w:rPr>
-          <w:rFonts w:ascii="Arial" w:hAnsi="Arial"/>
-        </w:rPr>
-        <w:t>const</w:t>
-      </w:r>
-      <w:proofErr w:type="spellEnd"/>
-      <w:r>
-        <w:rPr>
-          <w:rFonts w:ascii="Arial" w:hAnsi="Arial"/>
-        </w:rPr>
-        <w:t xml:space="preserve"> resultado = </w:t>
-      </w:r>
-      <w:proofErr w:type="spellStart"/>
-      <w:r>
-        <w:rPr>
-          <w:rFonts w:ascii="Arial" w:hAnsi="Arial"/>
-        </w:rPr>
-        <w:t>await</w:t>
-      </w:r>
-      <w:proofErr w:type="spellEnd"/>
-      <w:r>
-        <w:rPr>
-          <w:rFonts w:ascii="Arial" w:hAnsi="Arial"/>
-        </w:rPr>
-        <w:t xml:space="preserve"> </w:t>
-      </w:r>
-      <w:proofErr w:type="spellStart"/>
-      <w:proofErr w:type="gramStart"/>
-      <w:r>
-        <w:rPr>
-          <w:rFonts w:ascii="Arial" w:hAnsi="Arial"/>
-        </w:rPr>
-        <w:t>queryAsync</w:t>
-      </w:r>
-      <w:proofErr w:type="spellEnd"/>
-      <w:r>
-        <w:rPr>
-          <w:rFonts w:ascii="Arial" w:hAnsi="Arial"/>
-        </w:rPr>
-        <w:t>(</w:t>
-      </w:r>
-      <w:proofErr w:type="gramEnd"/>
-      <w:r>
-        <w:rPr>
-          <w:rFonts w:ascii="Arial" w:hAnsi="Arial"/>
-        </w:rPr>
-        <w:t xml:space="preserve">"INSERT INTO produto </w:t>
-      </w:r>
-      <w:proofErr w:type="gramStart"/>
-      <w:r>
-        <w:rPr>
-          <w:rFonts w:ascii="Arial" w:hAnsi="Arial"/>
-        </w:rPr>
-        <w:t>SET ?</w:t>
-      </w:r>
-      <w:proofErr w:type="gramEnd"/>
-      <w:r>
-        <w:rPr>
-          <w:rFonts w:ascii="Arial" w:hAnsi="Arial"/>
-        </w:rPr>
-        <w:t>", [</w:t>
-      </w:r>
-    </w:p>
-    <w:p>
-      <w:pPr>
-        <w:rPr>
-          <w:rFonts w:ascii="Arial" w:hAnsi="Arial"/>
-        </w:rPr>
-      </w:pPr>
-      <w:r>
-        <w:rPr>
-          <w:rFonts w:ascii="Arial" w:hAnsi="Arial"/>
         </w:rPr>
         <w:t xml:space="preserve">      </w:t>
       </w:r>
@@ -3423,7 +3326,6 @@
         <w:t xml:space="preserve">    </w:t>
       </w:r>
       <w:proofErr w:type="spellStart"/>
-      <w:proofErr w:type="gramStart"/>
       <w:r>
         <w:rPr>
           <w:rFonts w:ascii="Arial" w:hAnsi="Arial"/>
@@ -3431,19 +3333,11 @@
         <w:t>res.status</w:t>
       </w:r>
       <w:proofErr w:type="spellEnd"/>
-      <w:proofErr w:type="gramEnd"/>
-      <w:r>
-        <w:rPr>
-          <w:rFonts w:ascii="Arial" w:hAnsi="Arial"/>
-        </w:rPr>
-        <w:t>(201</w:t>
-      </w:r>
-      <w:proofErr w:type="gramStart"/>
-      <w:r>
-        <w:rPr>
-          <w:rFonts w:ascii="Arial" w:hAnsi="Arial"/>
-        </w:rPr>
-        <w:t>).</w:t>
+      <w:r>
+        <w:rPr>
+          <w:rFonts w:ascii="Arial" w:hAnsi="Arial"/>
+        </w:rPr>
+        <w:t>(201).</w:t>
       </w:r>
       <w:proofErr w:type="spellStart"/>
       <w:r>
@@ -3453,7 +3347,6 @@
         <w:t>json</w:t>
       </w:r>
       <w:proofErr w:type="spellEnd"/>
-      <w:proofErr w:type="gramEnd"/>
       <w:r>
         <w:rPr>
           <w:rFonts w:ascii="Arial" w:hAnsi="Arial"/>
@@ -3522,7 +3415,6 @@
         <w:t xml:space="preserve">id: </w:t>
       </w:r>
       <w:proofErr w:type="spellStart"/>
-      <w:proofErr w:type="gramStart"/>
       <w:r>
         <w:rPr>
           <w:rFonts w:ascii="Arial" w:hAnsi="Arial"/>
@@ -3531,13 +3423,12 @@
         <w:t>resultado.insertId</w:t>
       </w:r>
       <w:proofErr w:type="spellEnd"/>
-      <w:proofErr w:type="gramEnd"/>
       <w:r>
         <w:rPr>
           <w:rFonts w:ascii="Arial" w:hAnsi="Arial"/>
           <w:lang w:val="en-US"/>
         </w:rPr>
-        <w:t>(),</w:t>
+        <w:t>,</w:t>
       </w:r>
     </w:p>
     <w:p>
@@ -3552,120 +3443,98 @@
           <w:rFonts w:ascii="Arial" w:hAnsi="Arial"/>
           <w:lang w:val="en-US"/>
         </w:rPr>
-        <w:t>    }</w:t>
-      </w:r>
-      <w:proofErr w:type="gramStart"/>
-      <w:r>
+        <w:t>    });</w:t>
+      </w:r>
+    </w:p>
+    <w:p>
+      <w:pPr>
         <w:rPr>
           <w:rFonts w:ascii="Arial" w:hAnsi="Arial"/>
           <w:lang w:val="en-US"/>
         </w:rPr>
-        <w:t>);</w:t>
-      </w:r>
-      <w:proofErr w:type="gramEnd"/>
-    </w:p>
-    <w:p>
-      <w:pPr>
+      </w:pPr>
+      <w:r>
         <w:rPr>
           <w:rFonts w:ascii="Arial" w:hAnsi="Arial"/>
           <w:lang w:val="en-US"/>
         </w:rPr>
-      </w:pPr>
+        <w:t>  } catch (</w:t>
+      </w:r>
+      <w:proofErr w:type="spellStart"/>
       <w:r>
         <w:rPr>
           <w:rFonts w:ascii="Arial" w:hAnsi="Arial"/>
           <w:lang w:val="en-US"/>
         </w:rPr>
-        <w:t>  } catch (</w:t>
-      </w:r>
-      <w:proofErr w:type="spellStart"/>
-      <w:proofErr w:type="gramStart"/>
+        <w:t>erro</w:t>
+      </w:r>
+      <w:proofErr w:type="spellEnd"/>
       <w:r>
         <w:rPr>
           <w:rFonts w:ascii="Arial" w:hAnsi="Arial"/>
           <w:lang w:val="en-US"/>
         </w:rPr>
-        <w:t>erro</w:t>
-      </w:r>
-      <w:proofErr w:type="spellEnd"/>
-      <w:r>
+        <w:t>) {</w:t>
+      </w:r>
+    </w:p>
+    <w:p>
+      <w:pPr>
         <w:rPr>
           <w:rFonts w:ascii="Arial" w:hAnsi="Arial"/>
           <w:lang w:val="en-US"/>
         </w:rPr>
-        <w:t>) {</w:t>
-      </w:r>
-      <w:proofErr w:type="gramEnd"/>
-    </w:p>
-    <w:p>
-      <w:pPr>
+      </w:pPr>
+      <w:r>
         <w:rPr>
           <w:rFonts w:ascii="Arial" w:hAnsi="Arial"/>
           <w:lang w:val="en-US"/>
         </w:rPr>
-      </w:pPr>
+        <w:t xml:space="preserve">    </w:t>
+      </w:r>
+      <w:proofErr w:type="spellStart"/>
       <w:r>
         <w:rPr>
           <w:rFonts w:ascii="Arial" w:hAnsi="Arial"/>
           <w:lang w:val="en-US"/>
         </w:rPr>
-        <w:t xml:space="preserve">    </w:t>
-      </w:r>
-      <w:proofErr w:type="spellStart"/>
-      <w:proofErr w:type="gramStart"/>
+        <w:t>res.status</w:t>
+      </w:r>
+      <w:proofErr w:type="spellEnd"/>
       <w:r>
         <w:rPr>
           <w:rFonts w:ascii="Arial" w:hAnsi="Arial"/>
           <w:lang w:val="en-US"/>
         </w:rPr>
-        <w:t>res.status</w:t>
-      </w:r>
-      <w:proofErr w:type="spellEnd"/>
-      <w:proofErr w:type="gramEnd"/>
+        <w:t>(500).</w:t>
+      </w:r>
+      <w:proofErr w:type="spellStart"/>
       <w:r>
         <w:rPr>
           <w:rFonts w:ascii="Arial" w:hAnsi="Arial"/>
           <w:lang w:val="en-US"/>
         </w:rPr>
-        <w:t>(500</w:t>
-      </w:r>
-      <w:proofErr w:type="gramStart"/>
+        <w:t>json</w:t>
+      </w:r>
+      <w:proofErr w:type="spellEnd"/>
       <w:r>
         <w:rPr>
           <w:rFonts w:ascii="Arial" w:hAnsi="Arial"/>
           <w:lang w:val="en-US"/>
         </w:rPr>
-        <w:t>).</w:t>
-      </w:r>
-      <w:proofErr w:type="spellStart"/>
+        <w:t>({</w:t>
+      </w:r>
+    </w:p>
+    <w:p>
+      <w:pPr>
+        <w:rPr>
+          <w:rFonts w:ascii="Arial" w:hAnsi="Arial"/>
+        </w:rPr>
+      </w:pPr>
       <w:r>
         <w:rPr>
           <w:rFonts w:ascii="Arial" w:hAnsi="Arial"/>
           <w:lang w:val="en-US"/>
         </w:rPr>
-        <w:t>json</w:t>
-      </w:r>
-      <w:proofErr w:type="spellEnd"/>
-      <w:proofErr w:type="gramEnd"/>
-      <w:r>
-        <w:rPr>
-          <w:rFonts w:ascii="Arial" w:hAnsi="Arial"/>
-          <w:lang w:val="en-US"/>
-        </w:rPr>
-        <w:t>({</w:t>
-      </w:r>
-    </w:p>
-    <w:p>
-      <w:pPr>
-        <w:rPr>
-          <w:rFonts w:ascii="Arial" w:hAnsi="Arial"/>
-        </w:rPr>
-      </w:pPr>
-      <w:r>
-        <w:rPr>
-          <w:rFonts w:ascii="Arial" w:hAnsi="Arial"/>
-          <w:lang w:val="en-US"/>
-        </w:rPr>
         <w:t xml:space="preserve">      </w:t>
       </w:r>
       <w:r>
@@ -3701,7 +3570,6 @@
         <w:t xml:space="preserve">      erro: </w:t>
       </w:r>
       <w:proofErr w:type="spellStart"/>
-      <w:proofErr w:type="gramStart"/>
       <w:r>
         <w:rPr>
           <w:rFonts w:ascii="Arial" w:hAnsi="Arial"/>
@@ -3709,7 +3577,6 @@
         <w:t>erro.message</w:t>
       </w:r>
       <w:proofErr w:type="spellEnd"/>
-      <w:proofErr w:type="gramEnd"/>
       <w:r>
         <w:rPr>
           <w:rFonts w:ascii="Arial" w:hAnsi="Arial"/>
@@ -3920,7 +3787,6 @@
         <w:t xml:space="preserve"> -y”, que inicia o projeto com a criação do arquivo “</w:t>
       </w:r>
       <w:proofErr w:type="spellStart"/>
-      <w:proofErr w:type="gramStart"/>
       <w:r>
         <w:rPr>
           <w:rFonts w:ascii="Arial" w:hAnsi="Arial"/>
@@ -3928,7 +3794,6 @@
         <w:t>package.json</w:t>
       </w:r>
       <w:proofErr w:type="spellEnd"/>
-      <w:proofErr w:type="gramEnd"/>
       <w:r>
         <w:rPr>
           <w:rFonts w:ascii="Arial" w:hAnsi="Arial"/>
@@ -4037,14 +3902,7 @@
         <w:rPr>
           <w:rFonts w:ascii="Arial" w:hAnsi="Arial"/>
         </w:rPr>
-        <w:t xml:space="preserve"> Arquivos gerais do projeto </w:t>
-      </w:r>
-      <w:proofErr w:type="gramStart"/>
-      <w:r>
-        <w:rPr>
-          <w:rFonts w:ascii="Arial" w:hAnsi="Arial"/>
-        </w:rPr>
-        <w:t>(.</w:t>
+        <w:t xml:space="preserve"> Arquivos gerais do projeto (.</w:t>
       </w:r>
       <w:proofErr w:type="spellStart"/>
       <w:r>
@@ -4054,7 +3912,6 @@
         <w:t>env</w:t>
       </w:r>
       <w:proofErr w:type="spellEnd"/>
-      <w:proofErr w:type="gramEnd"/>
       <w:r>
         <w:rPr>
           <w:rFonts w:ascii="Arial" w:hAnsi="Arial"/>
@@ -4062,7 +3919,6 @@
         <w:t xml:space="preserve">, </w:t>
       </w:r>
       <w:proofErr w:type="spellStart"/>
-      <w:proofErr w:type="gramStart"/>
       <w:r>
         <w:rPr>
           <w:rFonts w:ascii="Arial" w:hAnsi="Arial"/>
@@ -4070,7 +3926,6 @@
         <w:t>package.json</w:t>
       </w:r>
       <w:proofErr w:type="spellEnd"/>
-      <w:proofErr w:type="gramEnd"/>
       <w:r>
         <w:rPr>
           <w:rFonts w:ascii="Arial" w:hAnsi="Arial"/>
@@ -4208,14 +4063,7 @@
         <w:rPr>
           <w:rFonts w:ascii="Arial" w:hAnsi="Arial"/>
         </w:rPr>
-        <w:t xml:space="preserve">O </w:t>
-      </w:r>
-      <w:proofErr w:type="gramStart"/>
-      <w:r>
-        <w:rPr>
-          <w:rFonts w:ascii="Arial" w:hAnsi="Arial"/>
-        </w:rPr>
-        <w:t xml:space="preserve">arquivo </w:t>
+        <w:t xml:space="preserve">O arquivo </w:t>
       </w:r>
       <w:r>
         <w:rPr>
@@ -4235,7 +4083,6 @@
         <w:t>env</w:t>
       </w:r>
       <w:proofErr w:type="spellEnd"/>
-      <w:proofErr w:type="gramEnd"/>
       <w:r>
         <w:rPr>
           <w:rFonts w:ascii="Arial" w:hAnsi="Arial"/>
@@ -4309,21 +4156,7 @@
         <w:rPr>
           <w:rFonts w:ascii="Arial" w:hAnsi="Arial"/>
         </w:rPr>
-        <w:t xml:space="preserve"> todas as credenciais do banco de dados, dando livre acesso a todas as informações pessoais, sejam da empresa, cliente, </w:t>
-      </w:r>
-      <w:proofErr w:type="gramStart"/>
-      <w:r>
-        <w:rPr>
-          <w:rFonts w:ascii="Arial" w:hAnsi="Arial"/>
-        </w:rPr>
-        <w:t>cartões, ou outros</w:t>
-      </w:r>
-      <w:proofErr w:type="gramEnd"/>
-      <w:r>
-        <w:rPr>
-          <w:rFonts w:ascii="Arial" w:hAnsi="Arial"/>
-        </w:rPr>
-        <w:t xml:space="preserve">. Essa exposição é um prato cheio para ataques direcionados que visam roubar essas credenciais e fazerem um uso indevido. Para evitar isso, o mais básico e comum, é simplesmente não deixar esse arquivo exposto (não </w:t>
+        <w:t xml:space="preserve"> todas as credenciais do banco de dados, dando livre acesso a todas as informações pessoais, sejam da empresa, cliente, cartões, ou outros. Essa exposição é um prato cheio para ataques direcionados que visam roubar essas credenciais e fazerem um uso indevido. Para evitar isso, o mais básico e comum, é simplesmente não deixar esse arquivo exposto (não </w:t>
       </w:r>
       <w:proofErr w:type="spellStart"/>
       <w:r>
@@ -4337,14 +4170,7 @@
         <w:rPr>
           <w:rFonts w:ascii="Arial" w:hAnsi="Arial"/>
         </w:rPr>
-        <w:t xml:space="preserve">), caso a aplicação seja subida no GitHub, uma prática é utilizar o </w:t>
-      </w:r>
-      <w:proofErr w:type="gramStart"/>
-      <w:r>
-        <w:rPr>
-          <w:rFonts w:ascii="Arial" w:hAnsi="Arial"/>
-        </w:rPr>
-        <w:t xml:space="preserve">arquivo </w:t>
+        <w:t xml:space="preserve">), caso a aplicação seja subida no GitHub, uma prática é utilizar o arquivo </w:t>
       </w:r>
       <w:r>
         <w:rPr>
@@ -4364,19 +4190,11 @@
         <w:t>gitignore</w:t>
       </w:r>
       <w:proofErr w:type="spellEnd"/>
-      <w:proofErr w:type="gramEnd"/>
-      <w:r>
-        <w:rPr>
-          <w:rFonts w:ascii="Arial" w:hAnsi="Arial"/>
-        </w:rPr>
-        <w:t xml:space="preserve"> para ignorar </w:t>
-      </w:r>
-      <w:proofErr w:type="gramStart"/>
-      <w:r>
-        <w:rPr>
-          <w:rFonts w:ascii="Arial" w:hAnsi="Arial"/>
-        </w:rPr>
-        <w:t xml:space="preserve">o </w:t>
+      <w:r>
+        <w:rPr>
+          <w:rFonts w:ascii="Arial" w:hAnsi="Arial"/>
+        </w:rPr>
+        <w:t xml:space="preserve"> para ignorar o </w:t>
       </w:r>
       <w:r>
         <w:rPr>
@@ -4396,26 +4214,11 @@
         <w:t>env</w:t>
       </w:r>
       <w:proofErr w:type="spellEnd"/>
-      <w:proofErr w:type="gramEnd"/>
-      <w:r>
-        <w:rPr>
-          <w:rFonts w:ascii="Arial" w:hAnsi="Arial"/>
-        </w:rPr>
-        <w:t xml:space="preserve"> e não </w:t>
-      </w:r>
-      <w:proofErr w:type="gramStart"/>
-      <w:r>
-        <w:rPr>
-          <w:rFonts w:ascii="Arial" w:hAnsi="Arial"/>
-        </w:rPr>
-        <w:t>subi-lo</w:t>
-      </w:r>
-      <w:proofErr w:type="gramEnd"/>
-      <w:r>
-        <w:rPr>
-          <w:rFonts w:ascii="Arial" w:hAnsi="Arial"/>
-        </w:rPr>
-        <w:t xml:space="preserve"> junto com os outros.</w:t>
+      <w:r>
+        <w:rPr>
+          <w:rFonts w:ascii="Arial" w:hAnsi="Arial"/>
+        </w:rPr>
+        <w:t xml:space="preserve"> e não subi-lo junto com os outros.</w:t>
       </w:r>
     </w:p>
     <w:p>
@@ -4463,7 +4266,6 @@
         <w:t xml:space="preserve">O arquivo </w:t>
       </w:r>
       <w:proofErr w:type="spellStart"/>
-      <w:proofErr w:type="gramStart"/>
       <w:r>
         <w:rPr>
           <w:rFonts w:ascii="Arial" w:hAnsi="Arial"/>
@@ -4473,7 +4275,6 @@
         <w:t>package.json</w:t>
       </w:r>
       <w:proofErr w:type="spellEnd"/>
-      <w:proofErr w:type="gramEnd"/>
       <w:r>
         <w:rPr>
           <w:rFonts w:ascii="Arial" w:hAnsi="Arial"/>
@@ -5950,6 +5751,7 @@
   <w:style w:type="character" w:default="1" w:styleId="Fontepargpadro">
     <w:name w:val="Default Paragraph Font"/>
     <w:uiPriority w:val="1"/>
+    <w:semiHidden/>
     <w:unhideWhenUsed/>
   </w:style>
   <w:style w:type="table" w:default="1" w:styleId="Tabelanormal">

</xml_diff>